<commit_message>
auto: push changes 13-07-Mon_13-06-16
</commit_message>
<xml_diff>
--- a/Generateur Des Factures/Factures/Facture numéro 5-2026.docx
+++ b/Generateur Des Factures/Factures/Facture numéro 5-2026.docx
@@ -225,7 +225,7 @@
     </w:p>
     <w:tbl>
       <w:tblPr>
-        <w:tblStyle w:val="TableGrid"/>
+        <w:tblStyle w:val="Grilledutableau"/>
         <w:tblpPr w:leftFromText="180" w:rightFromText="180" w:vertAnchor="text" w:horzAnchor="page" w:tblpX="661" w:tblpY="318"/>
         <w:tblW w:w="9180" w:type="dxa"/>
         <w:tblBorders>
@@ -792,7 +792,29 @@
                 <w:szCs w:val="20"/>
                 <w:lang w:eastAsia="fr-MA"/>
               </w:rPr>
-              <w:t>Les 5, 6 avril 2026</w:t>
+              <w:t xml:space="preserve">Les 5, 6 </w:t>
+            </w:r>
+            <w:r>
+              <w:rPr>
+                <w:rFonts w:ascii="Arial" w:eastAsia="Times New Roman" w:hAnsi="Arial" w:cs="Arial"/>
+                <w:b/>
+                <w:bCs/>
+                <w:sz w:val="20"/>
+                <w:szCs w:val="20"/>
+                <w:lang w:eastAsia="fr-MA"/>
+              </w:rPr>
+              <w:t>juin</w:t>
+            </w:r>
+            <w:r>
+              <w:rPr>
+                <w:rFonts w:ascii="Arial" w:eastAsia="Times New Roman" w:hAnsi="Arial" w:cs="Arial"/>
+                <w:b/>
+                <w:bCs/>
+                <w:sz w:val="20"/>
+                <w:szCs w:val="20"/>
+                <w:lang w:eastAsia="fr-MA"/>
+              </w:rPr>
+              <w:t xml:space="preserve"> 2026</w:t>
             </w:r>
           </w:p>
           <w:p>
@@ -1229,7 +1251,7 @@
     </w:p>
     <w:tbl>
       <w:tblPr>
-        <w:tblStyle w:val="TableGrid"/>
+        <w:tblStyle w:val="Grilledutableau"/>
         <w:tblpPr w:leftFromText="141" w:rightFromText="141" w:vertAnchor="text" w:horzAnchor="page" w:tblpX="685" w:tblpY="-17"/>
         <w:tblOverlap w:val="never"/>
         <w:tblW w:w="9776" w:type="dxa"/>
@@ -1506,7 +1528,7 @@
 <w:ftr xmlns:wpc="http://schemas.microsoft.com/office/word/2010/wordprocessingCanvas" xmlns:cx="http://schemas.microsoft.com/office/drawing/2014/chartex" xmlns:cx1="http://schemas.microsoft.com/office/drawing/2015/9/8/chartex" xmlns:cx2="http://schemas.microsoft.com/office/drawing/2015/10/21/chartex" xmlns:cx3="http://schemas.microsoft.com/office/drawing/2016/5/9/chartex" xmlns:cx4="http://schemas.microsoft.com/office/drawing/2016/5/10/chartex" xmlns:cx5="http://schemas.microsoft.com/office/drawing/2016/5/11/chartex" xmlns:cx6="http://schemas.microsoft.com/office/drawing/2016/5/12/chartex" xmlns:cx7="http://schemas.microsoft.com/office/drawing/2016/5/13/chartex" xmlns:cx8="http://schemas.microsoft.com/office/drawing/2016/5/14/chartex" xmlns:mc="http://schemas.openxmlformats.org/markup-compatibility/2006" xmlns:aink="http://schemas.microsoft.com/office/drawing/2016/ink" xmlns:am3d="http://schemas.microsoft.com/office/drawing/2017/model3d" xmlns:o="urn:schemas-microsoft-com:office:office" xmlns:oel="http://schemas.microsoft.com/office/2019/extlst" xmlns:r="http://schemas.openxmlformats.org/officeDocument/2006/relationships" xmlns:m="http://schemas.openxmlformats.org/officeDocument/2006/math" xmlns:v="urn:schemas-microsoft-com:vml" xmlns:wp14="http://schemas.microsoft.com/office/word/2010/wordprocessingDrawing" xmlns:wp="http://schemas.openxmlformats.org/drawingml/2006/wordprocessingDrawing" xmlns:w10="urn:schemas-microsoft-com:office:word" xmlns:w="http://schemas.openxmlformats.org/wordprocessingml/2006/main" xmlns:w14="http://schemas.microsoft.com/office/word/2010/wordml" xmlns:w15="http://schemas.microsoft.com/office/word/2012/wordml" xmlns:w16cex="http://schemas.microsoft.com/office/word/2018/wordml/cex" xmlns:w16cid="http://schemas.microsoft.com/office/word/2016/wordml/cid" xmlns:w16="http://schemas.microsoft.com/office/word/2018/wordml" xmlns:w16du="http://schemas.microsoft.com/office/word/2023/wordml/word16du" xmlns:w16sdtdh="http://schemas.microsoft.com/office/word/2020/wordml/sdtdatahash" xmlns:w16sdtfl="http://schemas.microsoft.com/office/word/2024/wordml/sdtformatlock" xmlns:w16se="http://schemas.microsoft.com/office/word/2015/wordml/symex" xmlns:wpg="http://schemas.microsoft.com/office/word/2010/wordprocessingGroup" xmlns:wpi="http://schemas.microsoft.com/office/word/2010/wordprocessingInk" xmlns:wne="http://schemas.microsoft.com/office/word/2006/wordml" xmlns:wps="http://schemas.microsoft.com/office/word/2010/wordprocessingShape" mc:Ignorable="w14 w15 w16se w16cid w16 w16cex w16sdtdh w16sdtfl w16du wp14">
   <w:p>
     <w:pPr>
-      <w:pStyle w:val="Footer"/>
+      <w:pStyle w:val="Pieddepage"/>
     </w:pPr>
   </w:p>
 </w:ftr>
@@ -1516,7 +1538,7 @@
 <w:ftr xmlns:wpc="http://schemas.microsoft.com/office/word/2010/wordprocessingCanvas" xmlns:cx="http://schemas.microsoft.com/office/drawing/2014/chartex" xmlns:cx1="http://schemas.microsoft.com/office/drawing/2015/9/8/chartex" xmlns:cx2="http://schemas.microsoft.com/office/drawing/2015/10/21/chartex" xmlns:cx3="http://schemas.microsoft.com/office/drawing/2016/5/9/chartex" xmlns:cx4="http://schemas.microsoft.com/office/drawing/2016/5/10/chartex" xmlns:cx5="http://schemas.microsoft.com/office/drawing/2016/5/11/chartex" xmlns:cx6="http://schemas.microsoft.com/office/drawing/2016/5/12/chartex" xmlns:cx7="http://schemas.microsoft.com/office/drawing/2016/5/13/chartex" xmlns:cx8="http://schemas.microsoft.com/office/drawing/2016/5/14/chartex" xmlns:mc="http://schemas.openxmlformats.org/markup-compatibility/2006" xmlns:aink="http://schemas.microsoft.com/office/drawing/2016/ink" xmlns:am3d="http://schemas.microsoft.com/office/drawing/2017/model3d" xmlns:o="urn:schemas-microsoft-com:office:office" xmlns:oel="http://schemas.microsoft.com/office/2019/extlst" xmlns:r="http://schemas.openxmlformats.org/officeDocument/2006/relationships" xmlns:m="http://schemas.openxmlformats.org/officeDocument/2006/math" xmlns:v="urn:schemas-microsoft-com:vml" xmlns:wp14="http://schemas.microsoft.com/office/word/2010/wordprocessingDrawing" xmlns:wp="http://schemas.openxmlformats.org/drawingml/2006/wordprocessingDrawing" xmlns:w10="urn:schemas-microsoft-com:office:word" xmlns:w="http://schemas.openxmlformats.org/wordprocessingml/2006/main" xmlns:w14="http://schemas.microsoft.com/office/word/2010/wordml" xmlns:w15="http://schemas.microsoft.com/office/word/2012/wordml" xmlns:w16cex="http://schemas.microsoft.com/office/word/2018/wordml/cex" xmlns:w16cid="http://schemas.microsoft.com/office/word/2016/wordml/cid" xmlns:w16="http://schemas.microsoft.com/office/word/2018/wordml" xmlns:w16du="http://schemas.microsoft.com/office/word/2023/wordml/word16du" xmlns:w16sdtdh="http://schemas.microsoft.com/office/word/2020/wordml/sdtdatahash" xmlns:w16sdtfl="http://schemas.microsoft.com/office/word/2024/wordml/sdtformatlock" xmlns:w16se="http://schemas.microsoft.com/office/word/2015/wordml/symex" xmlns:wpg="http://schemas.microsoft.com/office/word/2010/wordprocessingGroup" xmlns:wpi="http://schemas.microsoft.com/office/word/2010/wordprocessingInk" xmlns:wne="http://schemas.microsoft.com/office/word/2006/wordml" xmlns:wps="http://schemas.microsoft.com/office/word/2010/wordprocessingShape" mc:Ignorable="w14 w15 w16se w16cid w16 w16cex w16sdtdh w16sdtfl w16du wp14">
   <w:p>
     <w:pPr>
-      <w:pStyle w:val="Footer"/>
+      <w:pStyle w:val="Pieddepage"/>
       <w:rPr>
         <w:rFonts w:ascii="Calibri" w:eastAsia="Calibri" w:hAnsi="Calibri" w:cs="Times New Roman"/>
         <w:sz w:val="26"/>
@@ -1543,9 +1565,8 @@
         <w:vertAlign w:val="superscript"/>
         <w:lang w:val="x-none" w:eastAsia="x-none"/>
       </w:rPr>
-      <w:t xml:space="preserve">Art 91 – II – 1° du Code </w:t>
+      <w:t>Art 91 – II – 1° du Code Général des Impôts.</w:t>
     </w:r>
-    <w:proofErr w:type="spellStart"/>
     <w:r>
       <w:rPr>
         <w:rFonts w:ascii="Calibri" w:eastAsia="Calibri" w:hAnsi="Calibri" w:cs="Times New Roman"/>
@@ -1554,49 +1575,6 @@
         <w:vertAlign w:val="superscript"/>
         <w:lang w:val="x-none" w:eastAsia="x-none"/>
       </w:rPr>
-      <w:t>Général</w:t>
-    </w:r>
-    <w:proofErr w:type="spellEnd"/>
-    <w:r>
-      <w:rPr>
-        <w:rFonts w:ascii="Calibri" w:eastAsia="Calibri" w:hAnsi="Calibri" w:cs="Times New Roman"/>
-        <w:sz w:val="26"/>
-        <w:szCs w:val="26"/>
-        <w:vertAlign w:val="superscript"/>
-        <w:lang w:val="x-none" w:eastAsia="x-none"/>
-      </w:rPr>
-      <w:t xml:space="preserve"> des </w:t>
-    </w:r>
-    <w:proofErr w:type="spellStart"/>
-    <w:r>
-      <w:rPr>
-        <w:rFonts w:ascii="Calibri" w:eastAsia="Calibri" w:hAnsi="Calibri" w:cs="Times New Roman"/>
-        <w:sz w:val="26"/>
-        <w:szCs w:val="26"/>
-        <w:vertAlign w:val="superscript"/>
-        <w:lang w:val="x-none" w:eastAsia="x-none"/>
-      </w:rPr>
-      <w:t>Impôts</w:t>
-    </w:r>
-    <w:proofErr w:type="spellEnd"/>
-    <w:r>
-      <w:rPr>
-        <w:rFonts w:ascii="Calibri" w:eastAsia="Calibri" w:hAnsi="Calibri" w:cs="Times New Roman"/>
-        <w:sz w:val="26"/>
-        <w:szCs w:val="26"/>
-        <w:vertAlign w:val="superscript"/>
-        <w:lang w:val="x-none" w:eastAsia="x-none"/>
-      </w:rPr>
-      <w:t>.</w:t>
-    </w:r>
-    <w:r>
-      <w:rPr>
-        <w:rFonts w:ascii="Calibri" w:eastAsia="Calibri" w:hAnsi="Calibri" w:cs="Times New Roman"/>
-        <w:sz w:val="26"/>
-        <w:szCs w:val="26"/>
-        <w:vertAlign w:val="superscript"/>
-        <w:lang w:val="x-none" w:eastAsia="x-none"/>
-      </w:rPr>
       <w:t xml:space="preserve">                                          </w:t>
     </w:r>
   </w:p>
@@ -1616,7 +1594,7 @@
   </w:p>
   <w:tbl>
     <w:tblPr>
-      <w:tblStyle w:val="TableGrid"/>
+      <w:tblStyle w:val="Grilledutableau"/>
       <w:tblW w:w="0" w:type="auto"/>
       <w:tblInd w:w="-5" w:type="dxa"/>
       <w:tblBorders>
@@ -1641,7 +1619,7 @@
         </w:tcPr>
         <w:p>
           <w:pPr>
-            <w:pStyle w:val="Footer"/>
+            <w:pStyle w:val="Pieddepage"/>
             <w:jc w:val="both"/>
             <w:rPr>
               <w:rFonts w:ascii="Calibri" w:eastAsia="Calibri" w:hAnsi="Calibri" w:cs="Times New Roman"/>
@@ -1651,7 +1629,6 @@
               <w:lang w:eastAsia="x-none"/>
             </w:rPr>
           </w:pPr>
-          <w:proofErr w:type="gramStart"/>
           <w:r>
             <w:rPr>
               <w:rFonts w:ascii="Calibri" w:eastAsia="Calibri" w:hAnsi="Calibri" w:cs="Times New Roman"/>
@@ -1662,20 +1639,7 @@
               <w:vertAlign w:val="superscript"/>
               <w:lang w:eastAsia="x-none"/>
             </w:rPr>
-            <w:t>Auto Entrepreneur</w:t>
-          </w:r>
-          <w:proofErr w:type="gramEnd"/>
-          <w:r>
-            <w:rPr>
-              <w:rFonts w:ascii="Calibri" w:eastAsia="Calibri" w:hAnsi="Calibri" w:cs="Times New Roman"/>
-              <w:b/>
-              <w:bCs/>
-              <w:sz w:val="26"/>
-              <w:szCs w:val="26"/>
-              <w:vertAlign w:val="superscript"/>
-              <w:lang w:eastAsia="x-none"/>
-            </w:rPr>
-            <w:t xml:space="preserve"> :    </w:t>
+            <w:t xml:space="preserve">Auto Entrepreneur :    </w:t>
           </w:r>
           <w:r>
             <w:rPr>
@@ -1706,7 +1670,7 @@
         </w:tcPr>
         <w:p>
           <w:pPr>
-            <w:pStyle w:val="Footer"/>
+            <w:pStyle w:val="Pieddepage"/>
             <w:jc w:val="both"/>
             <w:rPr>
               <w:rFonts w:ascii="Calibri" w:eastAsia="Calibri" w:hAnsi="Calibri" w:cs="Times New Roman"/>
@@ -1749,7 +1713,7 @@
         </w:tcPr>
         <w:p>
           <w:pPr>
-            <w:pStyle w:val="Footer"/>
+            <w:pStyle w:val="Pieddepage"/>
             <w:jc w:val="both"/>
             <w:rPr>
               <w:rFonts w:ascii="Calibri" w:eastAsia="Calibri" w:hAnsi="Calibri" w:cs="Times New Roman"/>
@@ -1790,7 +1754,7 @@
         </w:tcPr>
         <w:p>
           <w:pPr>
-            <w:pStyle w:val="Footer"/>
+            <w:pStyle w:val="Pieddepage"/>
             <w:jc w:val="both"/>
             <w:rPr>
               <w:rFonts w:ascii="Calibri" w:eastAsia="Calibri" w:hAnsi="Calibri" w:cs="Times New Roman"/>
@@ -1835,7 +1799,7 @@
         </w:tcPr>
         <w:p>
           <w:pPr>
-            <w:pStyle w:val="Footer"/>
+            <w:pStyle w:val="Pieddepage"/>
             <w:jc w:val="both"/>
             <w:rPr>
               <w:rFonts w:ascii="Calibri" w:eastAsia="Calibri" w:hAnsi="Calibri" w:cs="Times New Roman"/>
@@ -1855,33 +1819,7 @@
               <w:vertAlign w:val="superscript"/>
               <w:lang w:eastAsia="x-none"/>
             </w:rPr>
-            <w:t xml:space="preserve">ICE       </w:t>
-          </w:r>
-          <w:proofErr w:type="gramStart"/>
-          <w:r>
-            <w:rPr>
-              <w:rFonts w:ascii="Calibri" w:eastAsia="Calibri" w:hAnsi="Calibri" w:cs="Times New Roman"/>
-              <w:b/>
-              <w:bCs/>
-              <w:sz w:val="26"/>
-              <w:szCs w:val="26"/>
-              <w:vertAlign w:val="superscript"/>
-              <w:lang w:eastAsia="x-none"/>
-            </w:rPr>
-            <w:t xml:space="preserve">   :</w:t>
-          </w:r>
-          <w:proofErr w:type="gramEnd"/>
-          <w:r>
-            <w:rPr>
-              <w:rFonts w:ascii="Calibri" w:eastAsia="Calibri" w:hAnsi="Calibri" w:cs="Times New Roman"/>
-              <w:b/>
-              <w:bCs/>
-              <w:sz w:val="26"/>
-              <w:szCs w:val="26"/>
-              <w:vertAlign w:val="superscript"/>
-              <w:lang w:eastAsia="x-none"/>
-            </w:rPr>
-            <w:t xml:space="preserve">                        </w:t>
+            <w:t xml:space="preserve">ICE          :                        </w:t>
           </w:r>
           <w:r>
             <w:rPr>
@@ -1904,7 +1842,7 @@
         </w:tcPr>
         <w:p>
           <w:pPr>
-            <w:pStyle w:val="Footer"/>
+            <w:pStyle w:val="Pieddepage"/>
             <w:jc w:val="both"/>
             <w:rPr>
               <w:rFonts w:ascii="Calibri" w:eastAsia="Calibri" w:hAnsi="Calibri" w:cs="Times New Roman"/>
@@ -1957,7 +1895,7 @@
         </w:tcPr>
         <w:p>
           <w:pPr>
-            <w:pStyle w:val="Footer"/>
+            <w:pStyle w:val="Pieddepage"/>
             <w:jc w:val="both"/>
             <w:rPr>
               <w:rFonts w:ascii="Calibri" w:eastAsia="Calibri" w:hAnsi="Calibri" w:cs="Times New Roman"/>
@@ -1977,33 +1915,7 @@
               <w:vertAlign w:val="superscript"/>
               <w:lang w:eastAsia="x-none"/>
             </w:rPr>
-            <w:t xml:space="preserve">IF         </w:t>
-          </w:r>
-          <w:proofErr w:type="gramStart"/>
-          <w:r>
-            <w:rPr>
-              <w:rFonts w:ascii="Calibri" w:eastAsia="Calibri" w:hAnsi="Calibri" w:cs="Times New Roman"/>
-              <w:b/>
-              <w:bCs/>
-              <w:sz w:val="26"/>
-              <w:szCs w:val="26"/>
-              <w:vertAlign w:val="superscript"/>
-              <w:lang w:eastAsia="x-none"/>
-            </w:rPr>
-            <w:t xml:space="preserve">   :</w:t>
-          </w:r>
-          <w:proofErr w:type="gramEnd"/>
-          <w:r>
-            <w:rPr>
-              <w:rFonts w:ascii="Calibri" w:eastAsia="Calibri" w:hAnsi="Calibri" w:cs="Times New Roman"/>
-              <w:b/>
-              <w:bCs/>
-              <w:sz w:val="26"/>
-              <w:szCs w:val="26"/>
-              <w:vertAlign w:val="superscript"/>
-              <w:lang w:eastAsia="x-none"/>
-            </w:rPr>
-            <w:t xml:space="preserve">                        </w:t>
+            <w:t xml:space="preserve">IF            :                        </w:t>
           </w:r>
           <w:r>
             <w:rPr>
@@ -2026,7 +1938,7 @@
         </w:tcPr>
         <w:p>
           <w:pPr>
-            <w:pStyle w:val="Footer"/>
+            <w:pStyle w:val="Pieddepage"/>
             <w:jc w:val="both"/>
             <w:rPr>
               <w:rFonts w:ascii="Calibri" w:eastAsia="Calibri" w:hAnsi="Calibri" w:cs="Times New Roman"/>
@@ -2046,33 +1958,7 @@
               <w:vertAlign w:val="superscript"/>
               <w:lang w:eastAsia="x-none"/>
             </w:rPr>
-            <w:t>TEL</w:t>
-          </w:r>
-          <w:proofErr w:type="gramStart"/>
-          <w:r>
-            <w:rPr>
-              <w:rFonts w:ascii="Calibri" w:eastAsia="Calibri" w:hAnsi="Calibri" w:cs="Times New Roman"/>
-              <w:b/>
-              <w:bCs/>
-              <w:sz w:val="26"/>
-              <w:szCs w:val="26"/>
-              <w:vertAlign w:val="superscript"/>
-              <w:lang w:eastAsia="x-none"/>
-            </w:rPr>
-            <w:t xml:space="preserve">   :</w:t>
-          </w:r>
-          <w:proofErr w:type="gramEnd"/>
-          <w:r>
-            <w:rPr>
-              <w:rFonts w:ascii="Calibri" w:eastAsia="Calibri" w:hAnsi="Calibri" w:cs="Times New Roman"/>
-              <w:b/>
-              <w:bCs/>
-              <w:sz w:val="26"/>
-              <w:szCs w:val="26"/>
-              <w:vertAlign w:val="superscript"/>
-              <w:lang w:eastAsia="x-none"/>
-            </w:rPr>
-            <w:t xml:space="preserve">                         </w:t>
+            <w:t xml:space="preserve">TEL   :                         </w:t>
           </w:r>
           <w:r>
             <w:rPr>
@@ -2090,7 +1976,7 @@
   </w:tbl>
   <w:p>
     <w:pPr>
-      <w:pStyle w:val="Footer"/>
+      <w:pStyle w:val="Pieddepage"/>
       <w:jc w:val="both"/>
       <w:rPr>
         <w:sz w:val="26"/>
@@ -2105,7 +1991,7 @@
 <w:ftr xmlns:wpc="http://schemas.microsoft.com/office/word/2010/wordprocessingCanvas" xmlns:cx="http://schemas.microsoft.com/office/drawing/2014/chartex" xmlns:cx1="http://schemas.microsoft.com/office/drawing/2015/9/8/chartex" xmlns:cx2="http://schemas.microsoft.com/office/drawing/2015/10/21/chartex" xmlns:cx3="http://schemas.microsoft.com/office/drawing/2016/5/9/chartex" xmlns:cx4="http://schemas.microsoft.com/office/drawing/2016/5/10/chartex" xmlns:cx5="http://schemas.microsoft.com/office/drawing/2016/5/11/chartex" xmlns:cx6="http://schemas.microsoft.com/office/drawing/2016/5/12/chartex" xmlns:cx7="http://schemas.microsoft.com/office/drawing/2016/5/13/chartex" xmlns:cx8="http://schemas.microsoft.com/office/drawing/2016/5/14/chartex" xmlns:mc="http://schemas.openxmlformats.org/markup-compatibility/2006" xmlns:aink="http://schemas.microsoft.com/office/drawing/2016/ink" xmlns:am3d="http://schemas.microsoft.com/office/drawing/2017/model3d" xmlns:o="urn:schemas-microsoft-com:office:office" xmlns:oel="http://schemas.microsoft.com/office/2019/extlst" xmlns:r="http://schemas.openxmlformats.org/officeDocument/2006/relationships" xmlns:m="http://schemas.openxmlformats.org/officeDocument/2006/math" xmlns:v="urn:schemas-microsoft-com:vml" xmlns:wp14="http://schemas.microsoft.com/office/word/2010/wordprocessingDrawing" xmlns:wp="http://schemas.openxmlformats.org/drawingml/2006/wordprocessingDrawing" xmlns:w10="urn:schemas-microsoft-com:office:word" xmlns:w="http://schemas.openxmlformats.org/wordprocessingml/2006/main" xmlns:w14="http://schemas.microsoft.com/office/word/2010/wordml" xmlns:w15="http://schemas.microsoft.com/office/word/2012/wordml" xmlns:w16cex="http://schemas.microsoft.com/office/word/2018/wordml/cex" xmlns:w16cid="http://schemas.microsoft.com/office/word/2016/wordml/cid" xmlns:w16="http://schemas.microsoft.com/office/word/2018/wordml" xmlns:w16du="http://schemas.microsoft.com/office/word/2023/wordml/word16du" xmlns:w16sdtdh="http://schemas.microsoft.com/office/word/2020/wordml/sdtdatahash" xmlns:w16sdtfl="http://schemas.microsoft.com/office/word/2024/wordml/sdtformatlock" xmlns:w16se="http://schemas.microsoft.com/office/word/2015/wordml/symex" xmlns:wpg="http://schemas.microsoft.com/office/word/2010/wordprocessingGroup" xmlns:wpi="http://schemas.microsoft.com/office/word/2010/wordprocessingInk" xmlns:wne="http://schemas.microsoft.com/office/word/2006/wordml" xmlns:wps="http://schemas.microsoft.com/office/word/2010/wordprocessingShape" mc:Ignorable="w14 w15 w16se w16cid w16 w16cex w16sdtdh w16sdtfl w16du wp14">
   <w:p>
     <w:pPr>
-      <w:pStyle w:val="Footer"/>
+      <w:pStyle w:val="Pieddepage"/>
     </w:pPr>
   </w:p>
 </w:ftr>
@@ -2140,7 +2026,7 @@
 <w:hdr xmlns:wpc="http://schemas.microsoft.com/office/word/2010/wordprocessingCanvas" xmlns:cx="http://schemas.microsoft.com/office/drawing/2014/chartex" xmlns:cx1="http://schemas.microsoft.com/office/drawing/2015/9/8/chartex" xmlns:cx2="http://schemas.microsoft.com/office/drawing/2015/10/21/chartex" xmlns:cx3="http://schemas.microsoft.com/office/drawing/2016/5/9/chartex" xmlns:cx4="http://schemas.microsoft.com/office/drawing/2016/5/10/chartex" xmlns:cx5="http://schemas.microsoft.com/office/drawing/2016/5/11/chartex" xmlns:cx6="http://schemas.microsoft.com/office/drawing/2016/5/12/chartex" xmlns:cx7="http://schemas.microsoft.com/office/drawing/2016/5/13/chartex" xmlns:cx8="http://schemas.microsoft.com/office/drawing/2016/5/14/chartex" xmlns:mc="http://schemas.openxmlformats.org/markup-compatibility/2006" xmlns:aink="http://schemas.microsoft.com/office/drawing/2016/ink" xmlns:am3d="http://schemas.microsoft.com/office/drawing/2017/model3d" xmlns:o="urn:schemas-microsoft-com:office:office" xmlns:oel="http://schemas.microsoft.com/office/2019/extlst" xmlns:r="http://schemas.openxmlformats.org/officeDocument/2006/relationships" xmlns:m="http://schemas.openxmlformats.org/officeDocument/2006/math" xmlns:v="urn:schemas-microsoft-com:vml" xmlns:wp14="http://schemas.microsoft.com/office/word/2010/wordprocessingDrawing" xmlns:wp="http://schemas.openxmlformats.org/drawingml/2006/wordprocessingDrawing" xmlns:w10="urn:schemas-microsoft-com:office:word" xmlns:w="http://schemas.openxmlformats.org/wordprocessingml/2006/main" xmlns:w14="http://schemas.microsoft.com/office/word/2010/wordml" xmlns:w15="http://schemas.microsoft.com/office/word/2012/wordml" xmlns:w16cex="http://schemas.microsoft.com/office/word/2018/wordml/cex" xmlns:w16cid="http://schemas.microsoft.com/office/word/2016/wordml/cid" xmlns:w16="http://schemas.microsoft.com/office/word/2018/wordml" xmlns:w16du="http://schemas.microsoft.com/office/word/2023/wordml/word16du" xmlns:w16sdtdh="http://schemas.microsoft.com/office/word/2020/wordml/sdtdatahash" xmlns:w16sdtfl="http://schemas.microsoft.com/office/word/2024/wordml/sdtformatlock" xmlns:w16se="http://schemas.microsoft.com/office/word/2015/wordml/symex" xmlns:wpg="http://schemas.microsoft.com/office/word/2010/wordprocessingGroup" xmlns:wpi="http://schemas.microsoft.com/office/word/2010/wordprocessingInk" xmlns:wne="http://schemas.microsoft.com/office/word/2006/wordml" xmlns:wps="http://schemas.microsoft.com/office/word/2010/wordprocessingShape" mc:Ignorable="w14 w15 w16se w16cid w16 w16cex w16sdtdh w16sdtfl w16du wp14">
   <w:p>
     <w:pPr>
-      <w:pStyle w:val="Header"/>
+      <w:pStyle w:val="En-tte"/>
     </w:pPr>
   </w:p>
 </w:hdr>
@@ -2150,7 +2036,7 @@
 <w:hdr xmlns:wpc="http://schemas.microsoft.com/office/word/2010/wordprocessingCanvas" xmlns:cx="http://schemas.microsoft.com/office/drawing/2014/chartex" xmlns:cx1="http://schemas.microsoft.com/office/drawing/2015/9/8/chartex" xmlns:cx2="http://schemas.microsoft.com/office/drawing/2015/10/21/chartex" xmlns:cx3="http://schemas.microsoft.com/office/drawing/2016/5/9/chartex" xmlns:cx4="http://schemas.microsoft.com/office/drawing/2016/5/10/chartex" xmlns:cx5="http://schemas.microsoft.com/office/drawing/2016/5/11/chartex" xmlns:cx6="http://schemas.microsoft.com/office/drawing/2016/5/12/chartex" xmlns:cx7="http://schemas.microsoft.com/office/drawing/2016/5/13/chartex" xmlns:cx8="http://schemas.microsoft.com/office/drawing/2016/5/14/chartex" xmlns:mc="http://schemas.openxmlformats.org/markup-compatibility/2006" xmlns:aink="http://schemas.microsoft.com/office/drawing/2016/ink" xmlns:am3d="http://schemas.microsoft.com/office/drawing/2017/model3d" xmlns:o="urn:schemas-microsoft-com:office:office" xmlns:oel="http://schemas.microsoft.com/office/2019/extlst" xmlns:r="http://schemas.openxmlformats.org/officeDocument/2006/relationships" xmlns:m="http://schemas.openxmlformats.org/officeDocument/2006/math" xmlns:v="urn:schemas-microsoft-com:vml" xmlns:wp14="http://schemas.microsoft.com/office/word/2010/wordprocessingDrawing" xmlns:wp="http://schemas.openxmlformats.org/drawingml/2006/wordprocessingDrawing" xmlns:w10="urn:schemas-microsoft-com:office:word" xmlns:w="http://schemas.openxmlformats.org/wordprocessingml/2006/main" xmlns:w14="http://schemas.microsoft.com/office/word/2010/wordml" xmlns:w15="http://schemas.microsoft.com/office/word/2012/wordml" xmlns:w16cex="http://schemas.microsoft.com/office/word/2018/wordml/cex" xmlns:w16cid="http://schemas.microsoft.com/office/word/2016/wordml/cid" xmlns:w16="http://schemas.microsoft.com/office/word/2018/wordml" xmlns:w16du="http://schemas.microsoft.com/office/word/2023/wordml/word16du" xmlns:w16sdtdh="http://schemas.microsoft.com/office/word/2020/wordml/sdtdatahash" xmlns:w16sdtfl="http://schemas.microsoft.com/office/word/2024/wordml/sdtformatlock" xmlns:w16se="http://schemas.microsoft.com/office/word/2015/wordml/symex" xmlns:wpg="http://schemas.microsoft.com/office/word/2010/wordprocessingGroup" xmlns:wpi="http://schemas.microsoft.com/office/word/2010/wordprocessingInk" xmlns:wne="http://schemas.microsoft.com/office/word/2006/wordml" xmlns:wps="http://schemas.microsoft.com/office/word/2010/wordprocessingShape" mc:Ignorable="w14 w15 w16se w16cid w16 w16cex w16sdtdh w16sdtfl w16du wp14">
   <w:p>
     <w:pPr>
-      <w:pStyle w:val="Header"/>
+      <w:pStyle w:val="En-tte"/>
     </w:pPr>
   </w:p>
 </w:hdr>
@@ -2160,7 +2046,7 @@
 <w:hdr xmlns:wpc="http://schemas.microsoft.com/office/word/2010/wordprocessingCanvas" xmlns:cx="http://schemas.microsoft.com/office/drawing/2014/chartex" xmlns:cx1="http://schemas.microsoft.com/office/drawing/2015/9/8/chartex" xmlns:cx2="http://schemas.microsoft.com/office/drawing/2015/10/21/chartex" xmlns:cx3="http://schemas.microsoft.com/office/drawing/2016/5/9/chartex" xmlns:cx4="http://schemas.microsoft.com/office/drawing/2016/5/10/chartex" xmlns:cx5="http://schemas.microsoft.com/office/drawing/2016/5/11/chartex" xmlns:cx6="http://schemas.microsoft.com/office/drawing/2016/5/12/chartex" xmlns:cx7="http://schemas.microsoft.com/office/drawing/2016/5/13/chartex" xmlns:cx8="http://schemas.microsoft.com/office/drawing/2016/5/14/chartex" xmlns:mc="http://schemas.openxmlformats.org/markup-compatibility/2006" xmlns:aink="http://schemas.microsoft.com/office/drawing/2016/ink" xmlns:am3d="http://schemas.microsoft.com/office/drawing/2017/model3d" xmlns:o="urn:schemas-microsoft-com:office:office" xmlns:oel="http://schemas.microsoft.com/office/2019/extlst" xmlns:r="http://schemas.openxmlformats.org/officeDocument/2006/relationships" xmlns:m="http://schemas.openxmlformats.org/officeDocument/2006/math" xmlns:v="urn:schemas-microsoft-com:vml" xmlns:wp14="http://schemas.microsoft.com/office/word/2010/wordprocessingDrawing" xmlns:wp="http://schemas.openxmlformats.org/drawingml/2006/wordprocessingDrawing" xmlns:w10="urn:schemas-microsoft-com:office:word" xmlns:w="http://schemas.openxmlformats.org/wordprocessingml/2006/main" xmlns:w14="http://schemas.microsoft.com/office/word/2010/wordml" xmlns:w15="http://schemas.microsoft.com/office/word/2012/wordml" xmlns:w16cex="http://schemas.microsoft.com/office/word/2018/wordml/cex" xmlns:w16cid="http://schemas.microsoft.com/office/word/2016/wordml/cid" xmlns:w16="http://schemas.microsoft.com/office/word/2018/wordml" xmlns:w16du="http://schemas.microsoft.com/office/word/2023/wordml/word16du" xmlns:w16sdtdh="http://schemas.microsoft.com/office/word/2020/wordml/sdtdatahash" xmlns:w16sdtfl="http://schemas.microsoft.com/office/word/2024/wordml/sdtformatlock" xmlns:w16se="http://schemas.microsoft.com/office/word/2015/wordml/symex" xmlns:wpg="http://schemas.microsoft.com/office/word/2010/wordprocessingGroup" xmlns:wpi="http://schemas.microsoft.com/office/word/2010/wordprocessingInk" xmlns:wne="http://schemas.microsoft.com/office/word/2006/wordml" xmlns:wps="http://schemas.microsoft.com/office/word/2010/wordprocessingShape" mc:Ignorable="w14 w15 w16se w16cid w16 w16cex w16sdtdh w16sdtfl w16du wp14">
   <w:p>
     <w:pPr>
-      <w:pStyle w:val="Header"/>
+      <w:pStyle w:val="En-tte"/>
     </w:pPr>
   </w:p>
 </w:hdr>
@@ -3205,11 +3091,11 @@
     <w:qFormat/>
     <w:rsid w:val="00393904"/>
   </w:style>
-  <w:style w:type="paragraph" w:styleId="Heading1">
+  <w:style w:type="paragraph" w:styleId="Titre1">
     <w:name w:val="heading 1"/>
     <w:basedOn w:val="Normal"/>
     <w:next w:val="Normal"/>
-    <w:link w:val="Heading1Char"/>
+    <w:link w:val="Titre1Car"/>
     <w:uiPriority w:val="9"/>
     <w:qFormat/>
     <w:rsid w:val="00A179B6"/>
@@ -3226,11 +3112,11 @@
       <w:szCs w:val="40"/>
     </w:rPr>
   </w:style>
-  <w:style w:type="paragraph" w:styleId="Heading2">
+  <w:style w:type="paragraph" w:styleId="Titre2">
     <w:name w:val="heading 2"/>
     <w:basedOn w:val="Normal"/>
     <w:next w:val="Normal"/>
-    <w:link w:val="Heading2Char"/>
+    <w:link w:val="Titre2Car"/>
     <w:uiPriority w:val="9"/>
     <w:semiHidden/>
     <w:unhideWhenUsed/>
@@ -3249,11 +3135,11 @@
       <w:szCs w:val="32"/>
     </w:rPr>
   </w:style>
-  <w:style w:type="paragraph" w:styleId="Heading3">
+  <w:style w:type="paragraph" w:styleId="Titre3">
     <w:name w:val="heading 3"/>
     <w:basedOn w:val="Normal"/>
     <w:next w:val="Normal"/>
-    <w:link w:val="Heading3Char"/>
+    <w:link w:val="Titre3Car"/>
     <w:uiPriority w:val="9"/>
     <w:semiHidden/>
     <w:unhideWhenUsed/>
@@ -3272,11 +3158,11 @@
       <w:szCs w:val="28"/>
     </w:rPr>
   </w:style>
-  <w:style w:type="paragraph" w:styleId="Heading4">
+  <w:style w:type="paragraph" w:styleId="Titre4">
     <w:name w:val="heading 4"/>
     <w:basedOn w:val="Normal"/>
     <w:next w:val="Normal"/>
-    <w:link w:val="Heading4Char"/>
+    <w:link w:val="Titre4Car"/>
     <w:uiPriority w:val="9"/>
     <w:semiHidden/>
     <w:unhideWhenUsed/>
@@ -3295,11 +3181,11 @@
       <w:color w:val="2F5496" w:themeColor="accent1" w:themeShade="BF"/>
     </w:rPr>
   </w:style>
-  <w:style w:type="paragraph" w:styleId="Heading5">
+  <w:style w:type="paragraph" w:styleId="Titre5">
     <w:name w:val="heading 5"/>
     <w:basedOn w:val="Normal"/>
     <w:next w:val="Normal"/>
-    <w:link w:val="Heading5Char"/>
+    <w:link w:val="Titre5Car"/>
     <w:uiPriority w:val="9"/>
     <w:semiHidden/>
     <w:unhideWhenUsed/>
@@ -3316,11 +3202,11 @@
       <w:color w:val="2F5496" w:themeColor="accent1" w:themeShade="BF"/>
     </w:rPr>
   </w:style>
-  <w:style w:type="paragraph" w:styleId="Heading6">
+  <w:style w:type="paragraph" w:styleId="Titre6">
     <w:name w:val="heading 6"/>
     <w:basedOn w:val="Normal"/>
     <w:next w:val="Normal"/>
-    <w:link w:val="Heading6Char"/>
+    <w:link w:val="Titre6Car"/>
     <w:uiPriority w:val="9"/>
     <w:semiHidden/>
     <w:unhideWhenUsed/>
@@ -3339,11 +3225,11 @@
       <w:color w:val="595959" w:themeColor="text1" w:themeTint="A6"/>
     </w:rPr>
   </w:style>
-  <w:style w:type="paragraph" w:styleId="Heading7">
+  <w:style w:type="paragraph" w:styleId="Titre7">
     <w:name w:val="heading 7"/>
     <w:basedOn w:val="Normal"/>
     <w:next w:val="Normal"/>
-    <w:link w:val="Heading7Char"/>
+    <w:link w:val="Titre7Car"/>
     <w:uiPriority w:val="9"/>
     <w:semiHidden/>
     <w:unhideWhenUsed/>
@@ -3360,11 +3246,11 @@
       <w:color w:val="595959" w:themeColor="text1" w:themeTint="A6"/>
     </w:rPr>
   </w:style>
-  <w:style w:type="paragraph" w:styleId="Heading8">
+  <w:style w:type="paragraph" w:styleId="Titre8">
     <w:name w:val="heading 8"/>
     <w:basedOn w:val="Normal"/>
     <w:next w:val="Normal"/>
-    <w:link w:val="Heading8Char"/>
+    <w:link w:val="Titre8Car"/>
     <w:uiPriority w:val="9"/>
     <w:semiHidden/>
     <w:unhideWhenUsed/>
@@ -3383,11 +3269,11 @@
       <w:color w:val="272727" w:themeColor="text1" w:themeTint="D8"/>
     </w:rPr>
   </w:style>
-  <w:style w:type="paragraph" w:styleId="Heading9">
+  <w:style w:type="paragraph" w:styleId="Titre9">
     <w:name w:val="heading 9"/>
     <w:basedOn w:val="Normal"/>
     <w:next w:val="Normal"/>
-    <w:link w:val="Heading9Char"/>
+    <w:link w:val="Titre9Car"/>
     <w:uiPriority w:val="9"/>
     <w:semiHidden/>
     <w:unhideWhenUsed/>
@@ -3404,13 +3290,13 @@
       <w:color w:val="272727" w:themeColor="text1" w:themeTint="D8"/>
     </w:rPr>
   </w:style>
-  <w:style w:type="character" w:default="1" w:styleId="DefaultParagraphFont">
+  <w:style w:type="character" w:default="1" w:styleId="Policepardfaut">
     <w:name w:val="Default Paragraph Font"/>
     <w:uiPriority w:val="1"/>
     <w:semiHidden/>
     <w:unhideWhenUsed/>
   </w:style>
-  <w:style w:type="table" w:default="1" w:styleId="TableNormal">
+  <w:style w:type="table" w:default="1" w:styleId="TableauNormal">
     <w:name w:val="Normal Table"/>
     <w:uiPriority w:val="99"/>
     <w:semiHidden/>
@@ -3425,16 +3311,16 @@
       </w:tblCellMar>
     </w:tblPr>
   </w:style>
-  <w:style w:type="numbering" w:default="1" w:styleId="NoList">
+  <w:style w:type="numbering" w:default="1" w:styleId="Aucuneliste">
     <w:name w:val="No List"/>
     <w:uiPriority w:val="99"/>
     <w:semiHidden/>
     <w:unhideWhenUsed/>
   </w:style>
-  <w:style w:type="character" w:customStyle="1" w:styleId="Heading1Char">
-    <w:name w:val="Heading 1 Char"/>
-    <w:basedOn w:val="DefaultParagraphFont"/>
-    <w:link w:val="Heading1"/>
+  <w:style w:type="character" w:customStyle="1" w:styleId="Titre1Car">
+    <w:name w:val="Titre 1 Car"/>
+    <w:basedOn w:val="Policepardfaut"/>
+    <w:link w:val="Titre1"/>
     <w:uiPriority w:val="9"/>
     <w:rsid w:val="00A179B6"/>
     <w:rPr>
@@ -3444,10 +3330,10 @@
       <w:szCs w:val="40"/>
     </w:rPr>
   </w:style>
-  <w:style w:type="character" w:customStyle="1" w:styleId="Heading2Char">
-    <w:name w:val="Heading 2 Char"/>
-    <w:basedOn w:val="DefaultParagraphFont"/>
-    <w:link w:val="Heading2"/>
+  <w:style w:type="character" w:customStyle="1" w:styleId="Titre2Car">
+    <w:name w:val="Titre 2 Car"/>
+    <w:basedOn w:val="Policepardfaut"/>
+    <w:link w:val="Titre2"/>
     <w:uiPriority w:val="9"/>
     <w:semiHidden/>
     <w:rsid w:val="00A179B6"/>
@@ -3458,10 +3344,10 @@
       <w:szCs w:val="32"/>
     </w:rPr>
   </w:style>
-  <w:style w:type="character" w:customStyle="1" w:styleId="Heading3Char">
-    <w:name w:val="Heading 3 Char"/>
-    <w:basedOn w:val="DefaultParagraphFont"/>
-    <w:link w:val="Heading3"/>
+  <w:style w:type="character" w:customStyle="1" w:styleId="Titre3Car">
+    <w:name w:val="Titre 3 Car"/>
+    <w:basedOn w:val="Policepardfaut"/>
+    <w:link w:val="Titre3"/>
     <w:uiPriority w:val="9"/>
     <w:semiHidden/>
     <w:rsid w:val="00A179B6"/>
@@ -3472,10 +3358,10 @@
       <w:szCs w:val="28"/>
     </w:rPr>
   </w:style>
-  <w:style w:type="character" w:customStyle="1" w:styleId="Heading4Char">
-    <w:name w:val="Heading 4 Char"/>
-    <w:basedOn w:val="DefaultParagraphFont"/>
-    <w:link w:val="Heading4"/>
+  <w:style w:type="character" w:customStyle="1" w:styleId="Titre4Car">
+    <w:name w:val="Titre 4 Car"/>
+    <w:basedOn w:val="Policepardfaut"/>
+    <w:link w:val="Titre4"/>
     <w:uiPriority w:val="9"/>
     <w:semiHidden/>
     <w:rsid w:val="00A179B6"/>
@@ -3486,10 +3372,10 @@
       <w:color w:val="2F5496" w:themeColor="accent1" w:themeShade="BF"/>
     </w:rPr>
   </w:style>
-  <w:style w:type="character" w:customStyle="1" w:styleId="Heading5Char">
-    <w:name w:val="Heading 5 Char"/>
-    <w:basedOn w:val="DefaultParagraphFont"/>
-    <w:link w:val="Heading5"/>
+  <w:style w:type="character" w:customStyle="1" w:styleId="Titre5Car">
+    <w:name w:val="Titre 5 Car"/>
+    <w:basedOn w:val="Policepardfaut"/>
+    <w:link w:val="Titre5"/>
     <w:uiPriority w:val="9"/>
     <w:semiHidden/>
     <w:rsid w:val="00A179B6"/>
@@ -3498,10 +3384,10 @@
       <w:color w:val="2F5496" w:themeColor="accent1" w:themeShade="BF"/>
     </w:rPr>
   </w:style>
-  <w:style w:type="character" w:customStyle="1" w:styleId="Heading6Char">
-    <w:name w:val="Heading 6 Char"/>
-    <w:basedOn w:val="DefaultParagraphFont"/>
-    <w:link w:val="Heading6"/>
+  <w:style w:type="character" w:customStyle="1" w:styleId="Titre6Car">
+    <w:name w:val="Titre 6 Car"/>
+    <w:basedOn w:val="Policepardfaut"/>
+    <w:link w:val="Titre6"/>
     <w:uiPriority w:val="9"/>
     <w:semiHidden/>
     <w:rsid w:val="00A179B6"/>
@@ -3512,10 +3398,10 @@
       <w:color w:val="595959" w:themeColor="text1" w:themeTint="A6"/>
     </w:rPr>
   </w:style>
-  <w:style w:type="character" w:customStyle="1" w:styleId="Heading7Char">
-    <w:name w:val="Heading 7 Char"/>
-    <w:basedOn w:val="DefaultParagraphFont"/>
-    <w:link w:val="Heading7"/>
+  <w:style w:type="character" w:customStyle="1" w:styleId="Titre7Car">
+    <w:name w:val="Titre 7 Car"/>
+    <w:basedOn w:val="Policepardfaut"/>
+    <w:link w:val="Titre7"/>
     <w:uiPriority w:val="9"/>
     <w:semiHidden/>
     <w:rsid w:val="00A179B6"/>
@@ -3524,10 +3410,10 @@
       <w:color w:val="595959" w:themeColor="text1" w:themeTint="A6"/>
     </w:rPr>
   </w:style>
-  <w:style w:type="character" w:customStyle="1" w:styleId="Heading8Char">
-    <w:name w:val="Heading 8 Char"/>
-    <w:basedOn w:val="DefaultParagraphFont"/>
-    <w:link w:val="Heading8"/>
+  <w:style w:type="character" w:customStyle="1" w:styleId="Titre8Car">
+    <w:name w:val="Titre 8 Car"/>
+    <w:basedOn w:val="Policepardfaut"/>
+    <w:link w:val="Titre8"/>
     <w:uiPriority w:val="9"/>
     <w:semiHidden/>
     <w:rsid w:val="00A179B6"/>
@@ -3538,10 +3424,10 @@
       <w:color w:val="272727" w:themeColor="text1" w:themeTint="D8"/>
     </w:rPr>
   </w:style>
-  <w:style w:type="character" w:customStyle="1" w:styleId="Heading9Char">
-    <w:name w:val="Heading 9 Char"/>
-    <w:basedOn w:val="DefaultParagraphFont"/>
-    <w:link w:val="Heading9"/>
+  <w:style w:type="character" w:customStyle="1" w:styleId="Titre9Car">
+    <w:name w:val="Titre 9 Car"/>
+    <w:basedOn w:val="Policepardfaut"/>
+    <w:link w:val="Titre9"/>
     <w:uiPriority w:val="9"/>
     <w:semiHidden/>
     <w:rsid w:val="00A179B6"/>
@@ -3550,11 +3436,11 @@
       <w:color w:val="272727" w:themeColor="text1" w:themeTint="D8"/>
     </w:rPr>
   </w:style>
-  <w:style w:type="paragraph" w:styleId="Title">
+  <w:style w:type="paragraph" w:styleId="Titre">
     <w:name w:val="Title"/>
     <w:basedOn w:val="Normal"/>
     <w:next w:val="Normal"/>
-    <w:link w:val="TitleChar"/>
+    <w:link w:val="TitreCar"/>
     <w:uiPriority w:val="10"/>
     <w:qFormat/>
     <w:rsid w:val="00A179B6"/>
@@ -3570,10 +3456,10 @@
       <w:szCs w:val="56"/>
     </w:rPr>
   </w:style>
-  <w:style w:type="character" w:customStyle="1" w:styleId="TitleChar">
-    <w:name w:val="Title Char"/>
-    <w:basedOn w:val="DefaultParagraphFont"/>
-    <w:link w:val="Title"/>
+  <w:style w:type="character" w:customStyle="1" w:styleId="TitreCar">
+    <w:name w:val="Titre Car"/>
+    <w:basedOn w:val="Policepardfaut"/>
+    <w:link w:val="Titre"/>
     <w:uiPriority w:val="10"/>
     <w:rsid w:val="00A179B6"/>
     <w:rPr>
@@ -3584,11 +3470,11 @@
       <w:szCs w:val="56"/>
     </w:rPr>
   </w:style>
-  <w:style w:type="paragraph" w:styleId="Subtitle">
+  <w:style w:type="paragraph" w:styleId="Sous-titre">
     <w:name w:val="Subtitle"/>
     <w:basedOn w:val="Normal"/>
     <w:next w:val="Normal"/>
-    <w:link w:val="SubtitleChar"/>
+    <w:link w:val="Sous-titreCar"/>
     <w:uiPriority w:val="11"/>
     <w:qFormat/>
     <w:rsid w:val="00A179B6"/>
@@ -3605,10 +3491,10 @@
       <w:szCs w:val="28"/>
     </w:rPr>
   </w:style>
-  <w:style w:type="character" w:customStyle="1" w:styleId="SubtitleChar">
-    <w:name w:val="Subtitle Char"/>
-    <w:basedOn w:val="DefaultParagraphFont"/>
-    <w:link w:val="Subtitle"/>
+  <w:style w:type="character" w:customStyle="1" w:styleId="Sous-titreCar">
+    <w:name w:val="Sous-titre Car"/>
+    <w:basedOn w:val="Policepardfaut"/>
+    <w:link w:val="Sous-titre"/>
     <w:uiPriority w:val="11"/>
     <w:rsid w:val="00A179B6"/>
     <w:rPr>
@@ -3619,11 +3505,11 @@
       <w:szCs w:val="28"/>
     </w:rPr>
   </w:style>
-  <w:style w:type="paragraph" w:styleId="Quote">
+  <w:style w:type="paragraph" w:styleId="Citation">
     <w:name w:val="Quote"/>
     <w:basedOn w:val="Normal"/>
     <w:next w:val="Normal"/>
-    <w:link w:val="QuoteChar"/>
+    <w:link w:val="CitationCar"/>
     <w:uiPriority w:val="29"/>
     <w:qFormat/>
     <w:rsid w:val="00A179B6"/>
@@ -3637,10 +3523,10 @@
       <w:color w:val="404040" w:themeColor="text1" w:themeTint="BF"/>
     </w:rPr>
   </w:style>
-  <w:style w:type="character" w:customStyle="1" w:styleId="QuoteChar">
-    <w:name w:val="Quote Char"/>
-    <w:basedOn w:val="DefaultParagraphFont"/>
-    <w:link w:val="Quote"/>
+  <w:style w:type="character" w:customStyle="1" w:styleId="CitationCar">
+    <w:name w:val="Citation Car"/>
+    <w:basedOn w:val="Policepardfaut"/>
+    <w:link w:val="Citation"/>
     <w:uiPriority w:val="29"/>
     <w:rsid w:val="00A179B6"/>
     <w:rPr>
@@ -3649,7 +3535,7 @@
       <w:color w:val="404040" w:themeColor="text1" w:themeTint="BF"/>
     </w:rPr>
   </w:style>
-  <w:style w:type="paragraph" w:styleId="ListParagraph">
+  <w:style w:type="paragraph" w:styleId="Paragraphedeliste">
     <w:name w:val="List Paragraph"/>
     <w:basedOn w:val="Normal"/>
     <w:uiPriority w:val="34"/>
@@ -3660,9 +3546,9 @@
       <w:contextualSpacing/>
     </w:pPr>
   </w:style>
-  <w:style w:type="character" w:styleId="IntenseEmphasis">
+  <w:style w:type="character" w:styleId="Accentuationintense">
     <w:name w:val="Intense Emphasis"/>
-    <w:basedOn w:val="DefaultParagraphFont"/>
+    <w:basedOn w:val="Policepardfaut"/>
     <w:uiPriority w:val="21"/>
     <w:qFormat/>
     <w:rsid w:val="00A179B6"/>
@@ -3672,11 +3558,11 @@
       <w:color w:val="2F5496" w:themeColor="accent1" w:themeShade="BF"/>
     </w:rPr>
   </w:style>
-  <w:style w:type="paragraph" w:styleId="IntenseQuote">
+  <w:style w:type="paragraph" w:styleId="Citationintense">
     <w:name w:val="Intense Quote"/>
     <w:basedOn w:val="Normal"/>
     <w:next w:val="Normal"/>
-    <w:link w:val="IntenseQuoteChar"/>
+    <w:link w:val="CitationintenseCar"/>
     <w:uiPriority w:val="30"/>
     <w:qFormat/>
     <w:rsid w:val="00A179B6"/>
@@ -3695,10 +3581,10 @@
       <w:color w:val="2F5496" w:themeColor="accent1" w:themeShade="BF"/>
     </w:rPr>
   </w:style>
-  <w:style w:type="character" w:customStyle="1" w:styleId="IntenseQuoteChar">
-    <w:name w:val="Intense Quote Char"/>
-    <w:basedOn w:val="DefaultParagraphFont"/>
-    <w:link w:val="IntenseQuote"/>
+  <w:style w:type="character" w:customStyle="1" w:styleId="CitationintenseCar">
+    <w:name w:val="Citation intense Car"/>
+    <w:basedOn w:val="Policepardfaut"/>
+    <w:link w:val="Citationintense"/>
     <w:uiPriority w:val="30"/>
     <w:rsid w:val="00A179B6"/>
     <w:rPr>
@@ -3707,9 +3593,9 @@
       <w:color w:val="2F5496" w:themeColor="accent1" w:themeShade="BF"/>
     </w:rPr>
   </w:style>
-  <w:style w:type="character" w:styleId="IntenseReference">
+  <w:style w:type="character" w:styleId="Rfrenceintense">
     <w:name w:val="Intense Reference"/>
-    <w:basedOn w:val="DefaultParagraphFont"/>
+    <w:basedOn w:val="Policepardfaut"/>
     <w:uiPriority w:val="32"/>
     <w:qFormat/>
     <w:rsid w:val="00A179B6"/>
@@ -3721,10 +3607,10 @@
       <w:spacing w:val="5"/>
     </w:rPr>
   </w:style>
-  <w:style w:type="paragraph" w:styleId="FootnoteText">
+  <w:style w:type="paragraph" w:styleId="Notedebasdepage">
     <w:name w:val="footnote text"/>
     <w:basedOn w:val="Normal"/>
-    <w:link w:val="FootnoteTextChar"/>
+    <w:link w:val="NotedebasdepageCar"/>
     <w:uiPriority w:val="99"/>
     <w:unhideWhenUsed/>
     <w:rsid w:val="00EF4D84"/>
@@ -3738,10 +3624,10 @@
       <w:lang w:val="x-none" w:eastAsia="x-none"/>
     </w:rPr>
   </w:style>
-  <w:style w:type="character" w:customStyle="1" w:styleId="FootnoteTextChar">
-    <w:name w:val="Footnote Text Char"/>
-    <w:basedOn w:val="DefaultParagraphFont"/>
-    <w:link w:val="FootnoteText"/>
+  <w:style w:type="character" w:customStyle="1" w:styleId="NotedebasdepageCar">
+    <w:name w:val="Note de bas de page Car"/>
+    <w:basedOn w:val="Policepardfaut"/>
+    <w:link w:val="Notedebasdepage"/>
     <w:uiPriority w:val="99"/>
     <w:rsid w:val="00EF4D84"/>
     <w:rPr>
@@ -3751,7 +3637,7 @@
       <w:lang w:val="x-none" w:eastAsia="x-none"/>
     </w:rPr>
   </w:style>
-  <w:style w:type="character" w:styleId="FootnoteReference">
+  <w:style w:type="character" w:styleId="Appelnotedebasdep">
     <w:name w:val="footnote reference"/>
     <w:uiPriority w:val="99"/>
     <w:semiHidden/>
@@ -3761,10 +3647,10 @@
       <w:vertAlign w:val="superscript"/>
     </w:rPr>
   </w:style>
-  <w:style w:type="paragraph" w:styleId="Header">
+  <w:style w:type="paragraph" w:styleId="En-tte">
     <w:name w:val="header"/>
     <w:basedOn w:val="Normal"/>
-    <w:link w:val="HeaderChar"/>
+    <w:link w:val="En-tteCar"/>
     <w:uiPriority w:val="99"/>
     <w:unhideWhenUsed/>
     <w:rsid w:val="00EF4D84"/>
@@ -3776,17 +3662,17 @@
       <w:spacing w:after="0" w:line="240" w:lineRule="auto"/>
     </w:pPr>
   </w:style>
-  <w:style w:type="character" w:customStyle="1" w:styleId="HeaderChar">
-    <w:name w:val="Header Char"/>
-    <w:basedOn w:val="DefaultParagraphFont"/>
-    <w:link w:val="Header"/>
+  <w:style w:type="character" w:customStyle="1" w:styleId="En-tteCar">
+    <w:name w:val="En-tête Car"/>
+    <w:basedOn w:val="Policepardfaut"/>
+    <w:link w:val="En-tte"/>
     <w:uiPriority w:val="99"/>
     <w:rsid w:val="00EF4D84"/>
   </w:style>
-  <w:style w:type="paragraph" w:styleId="Footer">
+  <w:style w:type="paragraph" w:styleId="Pieddepage">
     <w:name w:val="footer"/>
     <w:basedOn w:val="Normal"/>
-    <w:link w:val="FooterChar"/>
+    <w:link w:val="PieddepageCar"/>
     <w:uiPriority w:val="99"/>
     <w:unhideWhenUsed/>
     <w:rsid w:val="00EF4D84"/>
@@ -3798,16 +3684,16 @@
       <w:spacing w:after="0" w:line="240" w:lineRule="auto"/>
     </w:pPr>
   </w:style>
-  <w:style w:type="character" w:customStyle="1" w:styleId="FooterChar">
-    <w:name w:val="Footer Char"/>
-    <w:basedOn w:val="DefaultParagraphFont"/>
-    <w:link w:val="Footer"/>
+  <w:style w:type="character" w:customStyle="1" w:styleId="PieddepageCar">
+    <w:name w:val="Pied de page Car"/>
+    <w:basedOn w:val="Policepardfaut"/>
+    <w:link w:val="Pieddepage"/>
     <w:uiPriority w:val="99"/>
     <w:rsid w:val="00EF4D84"/>
   </w:style>
-  <w:style w:type="table" w:styleId="TableGrid">
+  <w:style w:type="table" w:styleId="Grilledutableau">
     <w:name w:val="Table Grid"/>
-    <w:basedOn w:val="TableNormal"/>
+    <w:basedOn w:val="TableauNormal"/>
     <w:uiPriority w:val="39"/>
     <w:rsid w:val="003E66F8"/>
     <w:pPr>

</xml_diff>